<commit_message>
feat: complete public website restoration and institutional redesign for NSS VIIT (A)
</commit_message>
<xml_diff>
--- a/docs/01_PRD_NSS_VIIT_A.docx
+++ b/docs/01_PRD_NSS_VIIT_A.docx
@@ -1,17 +1,9 @@
 
 <file path=word/document.xml><?xml version="1.0" encoding="utf-8"?>
-<w:document xmlns:wpc="http://schemas.microsoft.com/office/word/2010/wordprocessingCanvas" xmlns:mo="http://schemas.microsoft.com/office/mac/office/2008/main" xmlns:mc="http://schemas.openxmlformats.org/markup-compatibility/2006" xmlns:mv="urn:schemas-microsoft-com:mac:vml" xmlns:o="urn:schemas-microsoft-com:office:office" xmlns:r="http://schemas.openxmlformats.org/officeDocument/2006/relationships" xmlns:m="http://schemas.openxmlformats.org/officeDocument/2006/math" xmlns:v="urn:schemas-microsoft-com:vml" xmlns:wp14="http://schemas.microsoft.com/office/word/2010/wordprocessingDrawing" xmlns:wp="http://schemas.openxmlformats.org/drawingml/2006/wordprocessingDrawing" xmlns:w10="urn:schemas-microsoft-com:office:word" xmlns:w="http://schemas.openxmlformats.org/wordprocessingml/2006/main" xmlns:w14="http://schemas.microsoft.com/office/word/2010/wordml" xmlns:wpg="http://schemas.microsoft.com/office/word/2010/wordprocessingGroup" xmlns:wpi="http://schemas.microsoft.com/office/word/2010/wordprocessingInk" xmlns:wne="http://schemas.microsoft.com/office/word/2006/wordml" xmlns:wps="http://schemas.microsoft.com/office/word/2010/wordprocessingShape" mc:Ignorable="w14 wp14">
+<w:document xmlns:w="http://schemas.openxmlformats.org/wordprocessingml/2006/main">
   <w:body>
     <w:p>
-      <w:pPr>
-        <w:spacing w:before="1200"/>
-      </w:pPr>
       <w:r>
-        <w:rPr>
-          <w:b/>
-          <w:color w:val="C3A66B"/>
-          <w:sz w:val="32"/>
-        </w:rPr>
         <w:t>NSS VIIT (A)</w:t>
       </w:r>
     </w:p>
@@ -25,11 +17,7 @@
     </w:p>
     <w:p>
       <w:r>
-        <w:rPr>
-          <w:color w:val="657067"/>
-          <w:sz w:val="24"/>
-        </w:rPr>
-        <w:t>Product scope, user groups, capabilities, workflows and acceptance criteria</w:t>
+        <w:t>Product scope, user groups, capabilities, workflows and acceptance criteria (Integrated with MY Bharat)</w:t>
       </w:r>
     </w:p>
     <w:p>
@@ -42,29 +30,22 @@
         <w:tblStyle w:val="TableGrid"/>
         <w:tblW w:type="auto" w:w="0"/>
         <w:jc w:val="center"/>
-        <w:tblLook w:firstColumn="1" w:firstRow="1" w:lastColumn="0" w:lastRow="0" w:noHBand="0" w:noVBand="1" w:val="04A0"/>
+        <w:tblLook w:firstRow="1" w:lastRow="0" w:firstColumn="1" w:lastColumn="0" w:noHBand="0" w:noVBand="1" w:val="04A0"/>
       </w:tblPr>
       <w:tblGrid>
-        <w:gridCol w:w="4997"/>
-        <w:gridCol w:w="4997"/>
+        <w:gridCol w:w="3000"/>
+        <w:gridCol w:w="6500"/>
       </w:tblGrid>
       <w:tr>
+        <w:trPr/>
         <w:tc>
           <w:tcPr>
-            <w:tcW w:type="dxa" w:w="4997"/>
-            <w:shd w:fill="1A3C29"/>
+            <w:tcW w:type="dxa" w:w="3000"/>
           </w:tcPr>
           <w:p>
-            <w:pPr>
-              <w:spacing w:after="40"/>
-            </w:pPr>
-            <w:r/>
             <w:r>
               <w:rPr>
-                <w:rFonts w:ascii="Aptos" w:hAnsi="Aptos"/>
                 <w:b/>
-                <w:color w:val="FFFFFF"/>
-                <w:sz w:val="16"/>
               </w:rPr>
               <w:t>Document control</w:t>
             </w:r>
@@ -72,20 +53,12 @@
         </w:tc>
         <w:tc>
           <w:tcPr>
-            <w:tcW w:type="dxa" w:w="4997"/>
-            <w:shd w:fill="1A3C29"/>
+            <w:tcW w:type="dxa" w:w="6500"/>
           </w:tcPr>
           <w:p>
-            <w:pPr>
-              <w:spacing w:after="40"/>
-            </w:pPr>
-            <w:r/>
             <w:r>
               <w:rPr>
-                <w:rFonts w:ascii="Aptos" w:hAnsi="Aptos"/>
                 <w:b/>
-                <w:color w:val="FFFFFF"/>
-                <w:sz w:val="16"/>
               </w:rPr>
               <w:t>Value</w:t>
             </w:r>
@@ -93,228 +66,121 @@
         </w:tc>
       </w:tr>
       <w:tr>
+        <w:trPr/>
         <w:tc>
           <w:tcPr>
-            <w:tcW w:type="dxa" w:w="4997"/>
-            <w:shd w:fill="F8F7F3"/>
+            <w:tcW w:type="dxa" w:w="3000"/>
           </w:tcPr>
           <w:p>
-            <w:pPr>
-              <w:spacing w:after="40"/>
-            </w:pPr>
-            <w:r/>
             <w:r>
-              <w:rPr>
-                <w:rFonts w:ascii="Aptos" w:hAnsi="Aptos"/>
-                <w:b w:val="0"/>
-                <w:color w:val="292D2A"/>
-                <w:sz w:val="16"/>
-              </w:rPr>
               <w:t>ID</w:t>
             </w:r>
           </w:p>
         </w:tc>
         <w:tc>
           <w:tcPr>
-            <w:tcW w:type="dxa" w:w="4997"/>
-            <w:shd w:fill="F8F7F3"/>
+            <w:tcW w:type="dxa" w:w="6500"/>
           </w:tcPr>
           <w:p>
-            <w:pPr>
-              <w:spacing w:after="40"/>
-            </w:pPr>
-            <w:r/>
             <w:r>
-              <w:rPr>
-                <w:rFonts w:ascii="Aptos" w:hAnsi="Aptos"/>
-                <w:b w:val="0"/>
-                <w:color w:val="292D2A"/>
-                <w:sz w:val="16"/>
-              </w:rPr>
               <w:t>DOC-01</w:t>
             </w:r>
           </w:p>
         </w:tc>
       </w:tr>
       <w:tr>
+        <w:trPr/>
         <w:tc>
           <w:tcPr>
-            <w:tcW w:type="dxa" w:w="4997"/>
+            <w:tcW w:type="dxa" w:w="3000"/>
           </w:tcPr>
           <w:p>
-            <w:pPr>
-              <w:spacing w:after="40"/>
-            </w:pPr>
-            <w:r/>
             <w:r>
-              <w:rPr>
-                <w:rFonts w:ascii="Aptos" w:hAnsi="Aptos"/>
-                <w:b w:val="0"/>
-                <w:color w:val="292D2A"/>
-                <w:sz w:val="16"/>
-              </w:rPr>
               <w:t>Version</w:t>
             </w:r>
           </w:p>
         </w:tc>
         <w:tc>
           <w:tcPr>
-            <w:tcW w:type="dxa" w:w="4997"/>
+            <w:tcW w:type="dxa" w:w="6500"/>
           </w:tcPr>
           <w:p>
-            <w:pPr>
-              <w:spacing w:after="40"/>
-            </w:pPr>
-            <w:r/>
             <w:r>
-              <w:rPr>
-                <w:rFonts w:ascii="Aptos" w:hAnsi="Aptos"/>
-                <w:b w:val="0"/>
-                <w:color w:val="292D2A"/>
-                <w:sz w:val="16"/>
-              </w:rPr>
-              <w:t>1.0 — planning baseline</w:t>
+              <w:t>2.0 — integrated baseline (with MY Bharat expansion)</w:t>
             </w:r>
           </w:p>
         </w:tc>
       </w:tr>
       <w:tr>
+        <w:trPr/>
         <w:tc>
           <w:tcPr>
-            <w:tcW w:type="dxa" w:w="4997"/>
-            <w:shd w:fill="F8F7F3"/>
+            <w:tcW w:type="dxa" w:w="3000"/>
           </w:tcPr>
           <w:p>
-            <w:pPr>
-              <w:spacing w:after="40"/>
-            </w:pPr>
-            <w:r/>
             <w:r>
-              <w:rPr>
-                <w:rFonts w:ascii="Aptos" w:hAnsi="Aptos"/>
-                <w:b w:val="0"/>
-                <w:color w:val="292D2A"/>
-                <w:sz w:val="16"/>
-              </w:rPr>
               <w:t>Project</w:t>
             </w:r>
           </w:p>
         </w:tc>
         <w:tc>
           <w:tcPr>
-            <w:tcW w:type="dxa" w:w="4997"/>
-            <w:shd w:fill="F8F7F3"/>
+            <w:tcW w:type="dxa" w:w="6500"/>
           </w:tcPr>
           <w:p>
-            <w:pPr>
-              <w:spacing w:after="40"/>
-            </w:pPr>
-            <w:r/>
             <w:r>
-              <w:rPr>
-                <w:rFonts w:ascii="Aptos" w:hAnsi="Aptos"/>
-                <w:b w:val="0"/>
-                <w:color w:val="292D2A"/>
-                <w:sz w:val="16"/>
-              </w:rPr>
               <w:t>NSS VIIT (A) — complete website and digital platform</w:t>
             </w:r>
           </w:p>
         </w:tc>
       </w:tr>
       <w:tr>
+        <w:trPr/>
         <w:tc>
           <w:tcPr>
-            <w:tcW w:type="dxa" w:w="4997"/>
+            <w:tcW w:type="dxa" w:w="3000"/>
           </w:tcPr>
           <w:p>
-            <w:pPr>
-              <w:spacing w:after="40"/>
-            </w:pPr>
-            <w:r/>
             <w:r>
-              <w:rPr>
-                <w:rFonts w:ascii="Aptos" w:hAnsi="Aptos"/>
-                <w:b w:val="0"/>
-                <w:color w:val="292D2A"/>
-                <w:sz w:val="16"/>
-              </w:rPr>
               <w:t>Status</w:t>
             </w:r>
           </w:p>
         </w:tc>
         <w:tc>
           <w:tcPr>
-            <w:tcW w:type="dxa" w:w="4997"/>
+            <w:tcW w:type="dxa" w:w="6500"/>
           </w:tcPr>
           <w:p>
-            <w:pPr>
-              <w:spacing w:after="40"/>
-            </w:pPr>
-            <w:r/>
             <w:r>
-              <w:rPr>
-                <w:rFonts w:ascii="Aptos" w:hAnsi="Aptos"/>
-                <w:b w:val="0"/>
-                <w:color w:val="292D2A"/>
-                <w:sz w:val="16"/>
-              </w:rPr>
               <w:t>Requirements baseline; not an implementation or testing claim</w:t>
             </w:r>
           </w:p>
         </w:tc>
       </w:tr>
       <w:tr>
+        <w:trPr/>
         <w:tc>
           <w:tcPr>
-            <w:tcW w:type="dxa" w:w="4997"/>
-            <w:shd w:fill="F8F7F3"/>
+            <w:tcW w:type="dxa" w:w="3000"/>
           </w:tcPr>
           <w:p>
-            <w:pPr>
-              <w:spacing w:after="40"/>
-            </w:pPr>
-            <w:r/>
             <w:r>
-              <w:rPr>
-                <w:rFonts w:ascii="Aptos" w:hAnsi="Aptos"/>
-                <w:b w:val="0"/>
-                <w:color w:val="292D2A"/>
-                <w:sz w:val="16"/>
-              </w:rPr>
               <w:t>Approval</w:t>
             </w:r>
           </w:p>
         </w:tc>
         <w:tc>
           <w:tcPr>
-            <w:tcW w:type="dxa" w:w="4997"/>
-            <w:shd w:fill="F8F7F3"/>
+            <w:tcW w:type="dxa" w:w="6500"/>
           </w:tcPr>
           <w:p>
-            <w:pPr>
-              <w:spacing w:after="40"/>
-            </w:pPr>
-            <w:r/>
             <w:r>
-              <w:rPr>
-                <w:rFonts w:ascii="Aptos" w:hAnsi="Aptos"/>
-                <w:b w:val="0"/>
-                <w:color w:val="292D2A"/>
-                <w:sz w:val="16"/>
-              </w:rPr>
               <w:t>Review by both primary NSS administrators and college-authorized authority where applicable</w:t>
             </w:r>
           </w:p>
         </w:tc>
       </w:tr>
     </w:tbl>
-    <w:p/>
-    <w:p>
-      <w:r>
-        <w:br w:type="page"/>
-      </w:r>
-    </w:p>
     <w:p>
       <w:pPr>
         <w:pStyle w:val="Heading1"/>
@@ -325,7 +191,7 @@
     </w:p>
     <w:p>
       <w:r>
-        <w:t>Create one connected, premium and trustworthy digital platform for NSS VIIT (A): a public institutional website plus protected workspaces for the two primary administrators, 28-member Core Team and approved volunteers.</w:t>
+        <w:t>Create one connected, premium and trustworthy digital platform for NSS VIIT (A): a public institutional website plus protected workspaces for the two primary administrators, authorized coordinators, the 28-member Core Team, and approved student volunteers across NSS and MY Bharat initiatives.</w:t>
       </w:r>
     </w:p>
     <w:p>
@@ -339,7 +205,6 @@
     <w:p>
       <w:pPr>
         <w:pStyle w:val="ListBullet"/>
-        <w:spacing w:after="40"/>
       </w:pPr>
       <w:r>
         <w:t>Authentic-first: never invent events, statistics, awards, testimonials, contacts or institutional facts.</w:t>
@@ -348,7 +213,6 @@
     <w:p>
       <w:pPr>
         <w:pStyle w:val="ListBullet"/>
-        <w:spacing w:after="40"/>
       </w:pPr>
       <w:r>
         <w:t>Privacy by default: ordinary volunteer profiles, participation, internal files and confidential reports remain private.</w:t>
@@ -357,16 +221,14 @@
     <w:p>
       <w:pPr>
         <w:pStyle w:val="ListBullet"/>
-        <w:spacing w:after="40"/>
       </w:pPr>
       <w:r>
-        <w:t>Permission by responsibility: designation does not automatically grant system access.</w:t>
+        <w:t>Permission by responsibility: designation does not automatically grant system access; affiliation, team designation and administrative privileges remain strictly distinct.</w:t>
       </w:r>
     </w:p>
     <w:p>
       <w:pPr>
         <w:pStyle w:val="ListBullet"/>
-        <w:spacing w:after="40"/>
       </w:pPr>
       <w:r>
         <w:t>Approval before publication for events, reports, photographs, resources and announcements.</w:t>
@@ -375,7 +237,6 @@
     <w:p>
       <w:pPr>
         <w:pStyle w:val="ListBullet"/>
-        <w:spacing w:after="40"/>
       </w:pPr>
       <w:r>
         <w:t>Failure-safe behavior: clear errors, preserve data and never claim success without confirmation.</w:t>
@@ -384,7 +245,6 @@
     <w:p>
       <w:pPr>
         <w:pStyle w:val="ListBullet"/>
-        <w:spacing w:after="40"/>
       </w:pPr>
       <w:r>
         <w:t>Mobile-first, accessible quality with extraordinary but purposeful animation.</w:t>
@@ -403,29 +263,22 @@
         <w:tblStyle w:val="TableGrid"/>
         <w:tblW w:type="auto" w:w="0"/>
         <w:jc w:val="center"/>
-        <w:tblLook w:firstColumn="1" w:firstRow="1" w:lastColumn="0" w:lastRow="0" w:noHBand="0" w:noVBand="1" w:val="04A0"/>
+        <w:tblLook w:firstRow="1" w:lastRow="0" w:firstColumn="1" w:lastColumn="0" w:noHBand="0" w:noVBand="1" w:val="04A0"/>
       </w:tblPr>
       <w:tblGrid>
-        <w:gridCol w:w="4997"/>
-        <w:gridCol w:w="4997"/>
+        <w:gridCol w:w="3000"/>
+        <w:gridCol w:w="6500"/>
       </w:tblGrid>
       <w:tr>
+        <w:trPr/>
         <w:tc>
           <w:tcPr>
-            <w:tcW w:type="dxa" w:w="4997"/>
-            <w:shd w:fill="1A3C29"/>
+            <w:tcW w:type="dxa" w:w="3000"/>
           </w:tcPr>
           <w:p>
-            <w:pPr>
-              <w:spacing w:after="40"/>
-            </w:pPr>
-            <w:r/>
             <w:r>
               <w:rPr>
-                <w:rFonts w:ascii="Aptos" w:hAnsi="Aptos"/>
                 <w:b/>
-                <w:color w:val="FFFFFF"/>
-                <w:sz w:val="16"/>
               </w:rPr>
               <w:t>Item</w:t>
             </w:r>
@@ -433,20 +286,12 @@
         </w:tc>
         <w:tc>
           <w:tcPr>
-            <w:tcW w:type="dxa" w:w="4997"/>
-            <w:shd w:fill="1A3C29"/>
+            <w:tcW w:type="dxa" w:w="6500"/>
           </w:tcPr>
           <w:p>
-            <w:pPr>
-              <w:spacing w:after="40"/>
-            </w:pPr>
-            <w:r/>
             <w:r>
               <w:rPr>
-                <w:rFonts w:ascii="Aptos" w:hAnsi="Aptos"/>
                 <w:b/>
-                <w:color w:val="FFFFFF"/>
-                <w:sz w:val="16"/>
               </w:rPr>
               <w:t>Requirement</w:t>
             </w:r>
@@ -454,315 +299,196 @@
         </w:tc>
       </w:tr>
       <w:tr>
+        <w:trPr/>
         <w:tc>
           <w:tcPr>
-            <w:tcW w:type="dxa" w:w="4997"/>
-            <w:shd w:fill="F8F7F3"/>
+            <w:tcW w:type="dxa" w:w="3000"/>
           </w:tcPr>
           <w:p>
-            <w:pPr>
-              <w:spacing w:after="40"/>
-            </w:pPr>
-            <w:r/>
             <w:r>
-              <w:rPr>
-                <w:rFonts w:ascii="Aptos" w:hAnsi="Aptos"/>
-                <w:b w:val="0"/>
-                <w:color w:val="292D2A"/>
-                <w:sz w:val="16"/>
-              </w:rPr>
               <w:t>Brand</w:t>
             </w:r>
           </w:p>
         </w:tc>
         <w:tc>
           <w:tcPr>
-            <w:tcW w:type="dxa" w:w="4997"/>
-            <w:shd w:fill="F8F7F3"/>
+            <w:tcW w:type="dxa" w:w="6500"/>
           </w:tcPr>
           <w:p>
-            <w:pPr>
-              <w:spacing w:after="40"/>
-            </w:pPr>
-            <w:r/>
             <w:r>
-              <w:rPr>
-                <w:rFonts w:ascii="Aptos" w:hAnsi="Aptos"/>
-                <w:b w:val="0"/>
-                <w:color w:val="292D2A"/>
-                <w:sz w:val="16"/>
-              </w:rPr>
-              <w:t>Exact name NSS VIIT (A); one official NSS unit; no SAC content.</w:t>
+              <w:t>Exact name NSS VIIT (A); one official NSS unit; MY Bharat integrated as dedicated initiative; no SAC content.</w:t>
             </w:r>
           </w:p>
         </w:tc>
       </w:tr>
       <w:tr>
+        <w:trPr/>
         <w:tc>
           <w:tcPr>
-            <w:tcW w:type="dxa" w:w="4997"/>
+            <w:tcW w:type="dxa" w:w="3000"/>
           </w:tcPr>
           <w:p>
-            <w:pPr>
-              <w:spacing w:after="40"/>
-            </w:pPr>
-            <w:r/>
             <w:r>
-              <w:rPr>
-                <w:rFonts w:ascii="Aptos" w:hAnsi="Aptos"/>
-                <w:b w:val="0"/>
-                <w:color w:val="292D2A"/>
-                <w:sz w:val="16"/>
-              </w:rPr>
               <w:t>Institution</w:t>
             </w:r>
           </w:p>
         </w:tc>
         <w:tc>
           <w:tcPr>
-            <w:tcW w:type="dxa" w:w="4997"/>
+            <w:tcW w:type="dxa" w:w="6500"/>
           </w:tcPr>
           <w:p>
-            <w:pPr>
-              <w:spacing w:after="40"/>
-            </w:pPr>
-            <w:r/>
             <w:r>
-              <w:rPr>
-                <w:rFonts w:ascii="Aptos" w:hAnsi="Aptos"/>
-                <w:b w:val="0"/>
-                <w:color w:val="292D2A"/>
-                <w:sz w:val="16"/>
-              </w:rPr>
-              <w:t>Vignan’s Institute of Information Technology (Autonomous), Duvvada, Visakhapatnam.</w:t>
+              <w:t>Vignan's Institute of Information Technology (Autonomous), Duvvada, Visakhapatnam.</w:t>
             </w:r>
           </w:p>
         </w:tc>
       </w:tr>
       <w:tr>
+        <w:trPr/>
         <w:tc>
           <w:tcPr>
-            <w:tcW w:type="dxa" w:w="4997"/>
-            <w:shd w:fill="F8F7F3"/>
+            <w:tcW w:type="dxa" w:w="3000"/>
           </w:tcPr>
           <w:p>
-            <w:pPr>
-              <w:spacing w:after="40"/>
-            </w:pPr>
-            <w:r/>
             <w:r>
-              <w:rPr>
-                <w:rFonts w:ascii="Aptos" w:hAnsi="Aptos"/>
-                <w:b w:val="0"/>
-                <w:color w:val="292D2A"/>
-                <w:sz w:val="16"/>
-              </w:rPr>
               <w:t>Access areas</w:t>
             </w:r>
           </w:p>
         </w:tc>
         <w:tc>
           <w:tcPr>
-            <w:tcW w:type="dxa" w:w="4997"/>
-            <w:shd w:fill="F8F7F3"/>
+            <w:tcW w:type="dxa" w:w="6500"/>
           </w:tcPr>
           <w:p>
-            <w:pPr>
-              <w:spacing w:after="40"/>
-            </w:pPr>
-            <w:r/>
             <w:r>
-              <w:rPr>
-                <w:rFonts w:ascii="Aptos" w:hAnsi="Aptos"/>
-                <w:b w:val="0"/>
-                <w:color w:val="292D2A"/>
-                <w:sz w:val="16"/>
-              </w:rPr>
-              <w:t>Website Admin; NSS Operations Admin; NSS Core Team portal; Volunteer portal.</w:t>
+              <w:t>Website Admin; NSS Operations Admin; MY Bharat Coordinator workspace; Core Team workspace; Volunteer portal.</w:t>
             </w:r>
           </w:p>
         </w:tc>
       </w:tr>
       <w:tr>
+        <w:trPr/>
         <w:tc>
           <w:tcPr>
-            <w:tcW w:type="dxa" w:w="4997"/>
+            <w:tcW w:type="dxa" w:w="3000"/>
           </w:tcPr>
           <w:p>
-            <w:pPr>
-              <w:spacing w:after="40"/>
-            </w:pPr>
-            <w:r/>
             <w:r>
-              <w:rPr>
-                <w:rFonts w:ascii="Aptos" w:hAnsi="Aptos"/>
-                <w:b w:val="0"/>
-                <w:color w:val="292D2A"/>
-                <w:sz w:val="16"/>
-              </w:rPr>
-              <w:t>Scale</w:t>
+              <w:t>Scale &amp; Structure</w:t>
             </w:r>
           </w:p>
         </w:tc>
         <w:tc>
           <w:tcPr>
-            <w:tcW w:type="dxa" w:w="4997"/>
+            <w:tcW w:type="dxa" w:w="6500"/>
           </w:tcPr>
           <w:p>
-            <w:pPr>
-              <w:spacing w:after="40"/>
-            </w:pPr>
-            <w:r/>
             <w:r>
-              <w:rPr>
-                <w:rFonts w:ascii="Aptos" w:hAnsi="Aptos"/>
-                <w:b w:val="0"/>
-                <w:color w:val="292D2A"/>
-                <w:sz w:val="16"/>
-              </w:rPr>
-              <w:t>28 Core Team members; initial target up to 100 approved volunteers.</w:t>
+              <w:t>28 Core Team members total (24 NSS-designated, 4 MY Bharat-designated); initial target up to 100 approved volunteers.</w:t>
             </w:r>
           </w:p>
         </w:tc>
       </w:tr>
       <w:tr>
+        <w:trPr/>
         <w:tc>
           <w:tcPr>
-            <w:tcW w:type="dxa" w:w="4997"/>
-            <w:shd w:fill="F8F7F3"/>
+            <w:tcW w:type="dxa" w:w="3000"/>
           </w:tcPr>
           <w:p>
-            <w:pPr>
-              <w:spacing w:after="40"/>
-            </w:pPr>
-            <w:r/>
             <w:r>
-              <w:rPr>
-                <w:rFonts w:ascii="Aptos" w:hAnsi="Aptos"/>
-                <w:b w:val="0"/>
-                <w:color w:val="292D2A"/>
-                <w:sz w:val="16"/>
-              </w:rPr>
               <w:t>Lifecycle</w:t>
             </w:r>
           </w:p>
         </w:tc>
         <w:tc>
           <w:tcPr>
-            <w:tcW w:type="dxa" w:w="4997"/>
-            <w:shd w:fill="F8F7F3"/>
+            <w:tcW w:type="dxa" w:w="6500"/>
           </w:tcPr>
           <w:p>
-            <w:pPr>
-              <w:spacing w:after="40"/>
-            </w:pPr>
-            <w:r/>
             <w:r>
-              <w:rPr>
-                <w:rFonts w:ascii="Aptos" w:hAnsi="Aptos"/>
-                <w:b w:val="0"/>
-                <w:color w:val="292D2A"/>
-                <w:sz w:val="16"/>
-              </w:rPr>
               <w:t>Volunteers serve two years; preserve annual and combined history; read-only alumni access after completion.</w:t>
             </w:r>
           </w:p>
         </w:tc>
       </w:tr>
       <w:tr>
+        <w:trPr/>
         <w:tc>
           <w:tcPr>
-            <w:tcW w:type="dxa" w:w="4997"/>
+            <w:tcW w:type="dxa" w:w="3000"/>
           </w:tcPr>
           <w:p>
-            <w:pPr>
-              <w:spacing w:after="40"/>
-            </w:pPr>
-            <w:r/>
             <w:r>
-              <w:rPr>
-                <w:rFonts w:ascii="Aptos" w:hAnsi="Aptos"/>
-                <w:b w:val="0"/>
-                <w:color w:val="292D2A"/>
-                <w:sz w:val="16"/>
-              </w:rPr>
+              <w:t>Registration state</w:t>
+            </w:r>
+          </w:p>
+        </w:tc>
+        <w:tc>
+          <w:tcPr>
+            <w:tcW w:type="dxa" w:w="6500"/>
+          </w:tcPr>
+          <w:p>
+            <w:r>
+              <w:t>Registration stays strictly disabled/closed throughout development; opens only by separate authorized decision.</w:t>
+            </w:r>
+          </w:p>
+        </w:tc>
+      </w:tr>
+      <w:tr>
+        <w:trPr/>
+        <w:tc>
+          <w:tcPr>
+            <w:tcW w:type="dxa" w:w="3000"/>
+          </w:tcPr>
+          <w:p>
+            <w:r>
               <w:t>Language</w:t>
             </w:r>
           </w:p>
         </w:tc>
         <w:tc>
           <w:tcPr>
-            <w:tcW w:type="dxa" w:w="4997"/>
+            <w:tcW w:type="dxa" w:w="6500"/>
           </w:tcPr>
           <w:p>
-            <w:pPr>
-              <w:spacing w:after="40"/>
-            </w:pPr>
-            <w:r/>
             <w:r>
-              <w:rPr>
-                <w:rFonts w:ascii="Aptos" w:hAnsi="Aptos"/>
-                <w:b w:val="0"/>
-                <w:color w:val="292D2A"/>
-                <w:sz w:val="16"/>
-              </w:rPr>
               <w:t>English at launch; prepare architecture for possible Telugu support later.</w:t>
             </w:r>
           </w:p>
         </w:tc>
       </w:tr>
       <w:tr>
+        <w:trPr/>
         <w:tc>
           <w:tcPr>
-            <w:tcW w:type="dxa" w:w="4997"/>
-            <w:shd w:fill="F8F7F3"/>
+            <w:tcW w:type="dxa" w:w="3000"/>
           </w:tcPr>
           <w:p>
-            <w:pPr>
-              <w:spacing w:after="40"/>
-            </w:pPr>
-            <w:r/>
             <w:r>
-              <w:rPr>
-                <w:rFonts w:ascii="Aptos" w:hAnsi="Aptos"/>
-                <w:b w:val="0"/>
-                <w:color w:val="292D2A"/>
-                <w:sz w:val="16"/>
-              </w:rPr>
               <w:t>Launch approval</w:t>
             </w:r>
           </w:p>
         </w:tc>
         <w:tc>
           <w:tcPr>
-            <w:tcW w:type="dxa" w:w="4997"/>
-            <w:shd w:fill="F8F7F3"/>
+            <w:tcW w:type="dxa" w:w="6500"/>
           </w:tcPr>
           <w:p>
-            <w:pPr>
-              <w:spacing w:after="40"/>
-            </w:pPr>
-            <w:r/>
             <w:r>
-              <w:rPr>
-                <w:rFonts w:ascii="Aptos" w:hAnsi="Aptos"/>
-                <w:b w:val="0"/>
-                <w:color w:val="292D2A"/>
-                <w:sz w:val="16"/>
-              </w:rPr>
               <w:t>Joint approval by both primary NSS administrators and college-authorized authority.</w:t>
             </w:r>
           </w:p>
         </w:tc>
       </w:tr>
     </w:tbl>
-    <w:p/>
     <w:p>
       <w:pPr>
         <w:pStyle w:val="Heading1"/>
       </w:pPr>
       <w:r>
-        <w:t>4. User groups</w:t>
+        <w:t>4. User groups and role boundaries</w:t>
       </w:r>
     </w:p>
     <w:tbl>
@@ -770,30 +496,23 @@
         <w:tblStyle w:val="TableGrid"/>
         <w:tblW w:type="auto" w:w="0"/>
         <w:jc w:val="center"/>
-        <w:tblLook w:firstColumn="1" w:firstRow="1" w:lastColumn="0" w:lastRow="0" w:noHBand="0" w:noVBand="1" w:val="04A0"/>
+        <w:tblLook w:firstRow="1" w:lastRow="0" w:firstColumn="1" w:lastColumn="0" w:noHBand="0" w:noVBand="1" w:val="04A0"/>
       </w:tblPr>
       <w:tblGrid>
-        <w:gridCol w:w="3331"/>
-        <w:gridCol w:w="3331"/>
-        <w:gridCol w:w="3331"/>
+        <w:gridCol w:w="2400"/>
+        <w:gridCol w:w="4100"/>
+        <w:gridCol w:w="3000"/>
       </w:tblGrid>
       <w:tr>
+        <w:trPr/>
         <w:tc>
           <w:tcPr>
-            <w:tcW w:type="dxa" w:w="3331"/>
-            <w:shd w:fill="1A3C29"/>
+            <w:tcW w:type="dxa" w:w="2400"/>
           </w:tcPr>
           <w:p>
-            <w:pPr>
-              <w:spacing w:after="40"/>
-            </w:pPr>
-            <w:r/>
             <w:r>
               <w:rPr>
-                <w:rFonts w:ascii="Aptos" w:hAnsi="Aptos"/>
                 <w:b/>
-                <w:color w:val="FFFFFF"/>
-                <w:sz w:val="16"/>
               </w:rPr>
               <w:t>Group</w:t>
             </w:r>
@@ -801,20 +520,12 @@
         </w:tc>
         <w:tc>
           <w:tcPr>
-            <w:tcW w:type="dxa" w:w="3331"/>
-            <w:shd w:fill="1A3C29"/>
+            <w:tcW w:type="dxa" w:w="4100"/>
           </w:tcPr>
           <w:p>
-            <w:pPr>
-              <w:spacing w:after="40"/>
-            </w:pPr>
-            <w:r/>
             <w:r>
               <w:rPr>
-                <w:rFonts w:ascii="Aptos" w:hAnsi="Aptos"/>
                 <w:b/>
-                <w:color w:val="FFFFFF"/>
-                <w:sz w:val="16"/>
               </w:rPr>
               <w:t>Capabilities</w:t>
             </w:r>
@@ -822,20 +533,12 @@
         </w:tc>
         <w:tc>
           <w:tcPr>
-            <w:tcW w:type="dxa" w:w="3331"/>
-            <w:shd w:fill="1A3C29"/>
+            <w:tcW w:type="dxa" w:w="3000"/>
           </w:tcPr>
           <w:p>
-            <w:pPr>
-              <w:spacing w:after="40"/>
-            </w:pPr>
-            <w:r/>
             <w:r>
               <w:rPr>
-                <w:rFonts w:ascii="Aptos" w:hAnsi="Aptos"/>
                 <w:b/>
-                <w:color w:val="FFFFFF"/>
-                <w:sz w:val="16"/>
               </w:rPr>
               <w:t>Boundaries</w:t>
             </w:r>
@@ -843,326 +546,237 @@
         </w:tc>
       </w:tr>
       <w:tr>
+        <w:trPr/>
         <w:tc>
           <w:tcPr>
-            <w:tcW w:type="dxa" w:w="3331"/>
-            <w:shd w:fill="F8F7F3"/>
+            <w:tcW w:type="dxa" w:w="2400"/>
           </w:tcPr>
           <w:p>
-            <w:pPr>
-              <w:spacing w:after="40"/>
-            </w:pPr>
-            <w:r/>
             <w:r>
-              <w:rPr>
-                <w:rFonts w:ascii="Aptos" w:hAnsi="Aptos"/>
-                <w:b w:val="0"/>
-                <w:color w:val="292D2A"/>
-                <w:sz w:val="16"/>
-              </w:rPr>
               <w:t>Website Admin</w:t>
             </w:r>
           </w:p>
         </w:tc>
         <w:tc>
           <w:tcPr>
-            <w:tcW w:type="dxa" w:w="3331"/>
-            <w:shd w:fill="F8F7F3"/>
+            <w:tcW w:type="dxa" w:w="4100"/>
           </w:tcPr>
           <w:p>
-            <w:pPr>
-              <w:spacing w:after="40"/>
-            </w:pPr>
-            <w:r/>
             <w:r>
-              <w:rPr>
-                <w:rFonts w:ascii="Aptos" w:hAnsi="Aptos"/>
-                <w:b w:val="0"/>
-                <w:color w:val="292D2A"/>
-                <w:sz w:val="16"/>
-              </w:rPr>
               <w:t>Public pages, homepage layout/content, gallery, public resources, announcements, team profiles, preview/publish, versions.</w:t>
             </w:r>
           </w:p>
         </w:tc>
         <w:tc>
           <w:tcPr>
-            <w:tcW w:type="dxa" w:w="3331"/>
-            <w:shd w:fill="F8F7F3"/>
+            <w:tcW w:type="dxa" w:w="3000"/>
           </w:tcPr>
           <w:p>
-            <w:pPr>
-              <w:spacing w:after="40"/>
-            </w:pPr>
-            <w:r/>
             <w:r>
-              <w:rPr>
-                <w:rFonts w:ascii="Aptos" w:hAnsi="Aptos"/>
-                <w:b w:val="0"/>
-                <w:color w:val="292D2A"/>
-                <w:sz w:val="16"/>
-              </w:rPr>
-              <w:t>No automatic operational-data access.</w:t>
+              <w:t>No automatic operational-data or volunteer record access.</w:t>
             </w:r>
           </w:p>
         </w:tc>
       </w:tr>
       <w:tr>
+        <w:trPr/>
         <w:tc>
           <w:tcPr>
-            <w:tcW w:type="dxa" w:w="3331"/>
+            <w:tcW w:type="dxa" w:w="2400"/>
           </w:tcPr>
           <w:p>
-            <w:pPr>
-              <w:spacing w:after="40"/>
-            </w:pPr>
-            <w:r/>
             <w:r>
-              <w:rPr>
-                <w:rFonts w:ascii="Aptos" w:hAnsi="Aptos"/>
-                <w:b w:val="0"/>
-                <w:color w:val="292D2A"/>
-                <w:sz w:val="16"/>
-              </w:rPr>
               <w:t>NSS Operations Admin</w:t>
             </w:r>
           </w:p>
         </w:tc>
         <w:tc>
           <w:tcPr>
-            <w:tcW w:type="dxa" w:w="3331"/>
+            <w:tcW w:type="dxa" w:w="4100"/>
           </w:tcPr>
           <w:p>
-            <w:pPr>
-              <w:spacing w:after="40"/>
-            </w:pPr>
-            <w:r/>
             <w:r>
-              <w:rPr>
-                <w:rFonts w:ascii="Aptos" w:hAnsi="Aptos"/>
-                <w:b w:val="0"/>
-                <w:color w:val="292D2A"/>
-                <w:sz w:val="16"/>
-              </w:rPr>
-              <w:t>Manual volunteer approval, event operations, attendance corrections, service-hour records, reports and certificate eligibility review.</w:t>
+              <w:t>Manual NSS volunteer approval, NSS event operations, attendance corrections, service-hour records, reports and certificate eligibility review.</w:t>
             </w:r>
           </w:p>
         </w:tc>
         <w:tc>
           <w:tcPr>
-            <w:tcW w:type="dxa" w:w="3331"/>
+            <w:tcW w:type="dxa" w:w="3000"/>
           </w:tcPr>
           <w:p>
-            <w:pPr>
-              <w:spacing w:after="40"/>
-            </w:pPr>
-            <w:r/>
             <w:r>
-              <w:rPr>
-                <w:rFonts w:ascii="Aptos" w:hAnsi="Aptos"/>
-                <w:b w:val="0"/>
-                <w:color w:val="292D2A"/>
-                <w:sz w:val="16"/>
-              </w:rPr>
               <w:t>No automatic unrestricted website-design access.</w:t>
             </w:r>
           </w:p>
         </w:tc>
       </w:tr>
       <w:tr>
+        <w:trPr/>
         <w:tc>
           <w:tcPr>
-            <w:tcW w:type="dxa" w:w="3331"/>
-            <w:shd w:fill="F8F7F3"/>
+            <w:tcW w:type="dxa" w:w="2400"/>
           </w:tcPr>
           <w:p>
-            <w:pPr>
-              <w:spacing w:after="40"/>
-            </w:pPr>
-            <w:r/>
             <w:r>
-              <w:rPr>
-                <w:rFonts w:ascii="Aptos" w:hAnsi="Aptos"/>
-                <w:b w:val="0"/>
-                <w:color w:val="292D2A"/>
-                <w:sz w:val="16"/>
-              </w:rPr>
-              <w:t>Core Team</w:t>
+              <w:t>MY Bharat Coordinator (Proposed)</w:t>
             </w:r>
           </w:p>
         </w:tc>
         <w:tc>
           <w:tcPr>
-            <w:tcW w:type="dxa" w:w="3331"/>
-            <w:shd w:fill="F8F7F3"/>
+            <w:tcW w:type="dxa" w:w="4100"/>
           </w:tcPr>
           <w:p>
-            <w:pPr>
-              <w:spacing w:after="40"/>
-            </w:pPr>
-            <w:r/>
             <w:r>
-              <w:rPr>
-                <w:rFonts w:ascii="Aptos" w:hAnsi="Aptos"/>
-                <w:b w:val="0"/>
-                <w:color w:val="292D2A"/>
-                <w:sz w:val="16"/>
-              </w:rPr>
-              <w:t>Assigned tasks, event proposals, report/photo submissions, meetings, announcement drafts.</w:t>
+              <w:t>MY Bharat volunteer application review, MY Bharat event coordination, cell attendance recording and announcements drafting.</w:t>
             </w:r>
           </w:p>
         </w:tc>
         <w:tc>
           <w:tcPr>
-            <w:tcW w:type="dxa" w:w="3331"/>
-            <w:shd w:fill="F8F7F3"/>
+            <w:tcW w:type="dxa" w:w="3000"/>
           </w:tcPr>
           <w:p>
-            <w:pPr>
-              <w:spacing w:after="40"/>
-            </w:pPr>
-            <w:r/>
             <w:r>
-              <w:rPr>
-                <w:rFonts w:ascii="Aptos" w:hAnsi="Aptos"/>
-                <w:b w:val="0"/>
-                <w:color w:val="292D2A"/>
-                <w:sz w:val="16"/>
-              </w:rPr>
-              <w:t>Role title alone does not grant admin rights.</w:t>
+              <w:t>Scoped strictly to MY Bharat domain; no administrative control over NSS unit records.</w:t>
             </w:r>
           </w:p>
         </w:tc>
       </w:tr>
       <w:tr>
+        <w:trPr/>
         <w:tc>
           <w:tcPr>
-            <w:tcW w:type="dxa" w:w="3331"/>
+            <w:tcW w:type="dxa" w:w="2400"/>
           </w:tcPr>
           <w:p>
-            <w:pPr>
-              <w:spacing w:after="40"/>
-            </w:pPr>
-            <w:r/>
             <w:r>
-              <w:rPr>
-                <w:rFonts w:ascii="Aptos" w:hAnsi="Aptos"/>
-                <w:b w:val="0"/>
-                <w:color w:val="292D2A"/>
-                <w:sz w:val="16"/>
-              </w:rPr>
+              <w:t>Faculty / PO Reviewer (Proposed)</w:t>
+            </w:r>
+          </w:p>
+        </w:tc>
+        <w:tc>
+          <w:tcPr>
+            <w:tcW w:type="dxa" w:w="4100"/>
+          </w:tcPr>
+          <w:p>
+            <w:r>
+              <w:t>Programme Officer / Faculty oversight: review of Joint events, certificate eligibility sign-offs, annual institutional report approvals.</w:t>
+            </w:r>
+          </w:p>
+        </w:tc>
+        <w:tc>
+          <w:tcPr>
+            <w:tcW w:type="dxa" w:w="3000"/>
+          </w:tcPr>
+          <w:p>
+            <w:r>
+              <w:t>Strategic approval and audit authority; no routine daily website content editing.</w:t>
+            </w:r>
+          </w:p>
+        </w:tc>
+      </w:tr>
+      <w:tr>
+        <w:trPr/>
+        <w:tc>
+          <w:tcPr>
+            <w:tcW w:type="dxa" w:w="2400"/>
+          </w:tcPr>
+          <w:p>
+            <w:r>
+              <w:t>Core Team (28 Members)</w:t>
+            </w:r>
+          </w:p>
+        </w:tc>
+        <w:tc>
+          <w:tcPr>
+            <w:tcW w:type="dxa" w:w="4100"/>
+          </w:tcPr>
+          <w:p>
+            <w:r>
+              <w:t>Assigned tasks, event proposals, report/photo submissions, meetings, announcement drafts (24 NSS, 4 MY Bharat).</w:t>
+            </w:r>
+          </w:p>
+        </w:tc>
+        <w:tc>
+          <w:tcPr>
+            <w:tcW w:type="dxa" w:w="3000"/>
+          </w:tcPr>
+          <w:p>
+            <w:r>
+              <w:t>Role title or core-team membership alone confers zero administrative privileges.</w:t>
+            </w:r>
+          </w:p>
+        </w:tc>
+      </w:tr>
+      <w:tr>
+        <w:trPr/>
+        <w:tc>
+          <w:tcPr>
+            <w:tcW w:type="dxa" w:w="2400"/>
+          </w:tcPr>
+          <w:p>
+            <w:r>
               <w:t>Volunteer</w:t>
             </w:r>
           </w:p>
         </w:tc>
         <w:tc>
           <w:tcPr>
-            <w:tcW w:type="dxa" w:w="3331"/>
+            <w:tcW w:type="dxa" w:w="4100"/>
           </w:tcPr>
           <w:p>
-            <w:pPr>
-              <w:spacing w:after="40"/>
-            </w:pPr>
-            <w:r/>
             <w:r>
-              <w:rPr>
-                <w:rFonts w:ascii="Aptos" w:hAnsi="Aptos"/>
-                <w:b w:val="0"/>
-                <w:color w:val="292D2A"/>
-                <w:sz w:val="16"/>
-              </w:rPr>
               <w:t>Register for eligible events, view own attendance/hours, notifications, resources, support and own issued certificates.</w:t>
             </w:r>
           </w:p>
         </w:tc>
         <w:tc>
           <w:tcPr>
-            <w:tcW w:type="dxa" w:w="3331"/>
+            <w:tcW w:type="dxa" w:w="3000"/>
           </w:tcPr>
           <w:p>
-            <w:pPr>
-              <w:spacing w:after="40"/>
-            </w:pPr>
-            <w:r/>
             <w:r>
-              <w:rPr>
-                <w:rFonts w:ascii="Aptos" w:hAnsi="Aptos"/>
-                <w:b w:val="0"/>
-                <w:color w:val="292D2A"/>
-                <w:sz w:val="16"/>
-              </w:rPr>
-              <w:t>Cannot edit official attendance or see other volunteers’ private data.</w:t>
+              <w:t>Cannot edit official attendance or see other volunteers' private data.</w:t>
             </w:r>
           </w:p>
         </w:tc>
       </w:tr>
       <w:tr>
+        <w:trPr/>
         <w:tc>
           <w:tcPr>
-            <w:tcW w:type="dxa" w:w="3331"/>
-            <w:shd w:fill="F8F7F3"/>
+            <w:tcW w:type="dxa" w:w="2400"/>
           </w:tcPr>
           <w:p>
-            <w:pPr>
-              <w:spacing w:after="40"/>
-            </w:pPr>
-            <w:r/>
             <w:r>
-              <w:rPr>
-                <w:rFonts w:ascii="Aptos" w:hAnsi="Aptos"/>
-                <w:b w:val="0"/>
-                <w:color w:val="292D2A"/>
-                <w:sz w:val="16"/>
-              </w:rPr>
               <w:t>Alumni</w:t>
             </w:r>
           </w:p>
         </w:tc>
         <w:tc>
           <w:tcPr>
-            <w:tcW w:type="dxa" w:w="3331"/>
-            <w:shd w:fill="F8F7F3"/>
+            <w:tcW w:type="dxa" w:w="4100"/>
           </w:tcPr>
           <w:p>
-            <w:pPr>
-              <w:spacing w:after="40"/>
-            </w:pPr>
-            <w:r/>
             <w:r>
-              <w:rPr>
-                <w:rFonts w:ascii="Aptos" w:hAnsi="Aptos"/>
-                <w:b w:val="0"/>
-                <w:color w:val="292D2A"/>
-                <w:sz w:val="16"/>
-              </w:rPr>
               <w:t>Read-only own history, verified hours and issued certificates.</w:t>
             </w:r>
           </w:p>
         </w:tc>
         <w:tc>
           <w:tcPr>
-            <w:tcW w:type="dxa" w:w="3331"/>
-            <w:shd w:fill="F8F7F3"/>
+            <w:tcW w:type="dxa" w:w="3000"/>
           </w:tcPr>
           <w:p>
-            <w:pPr>
-              <w:spacing w:after="40"/>
-            </w:pPr>
-            <w:r/>
             <w:r>
-              <w:rPr>
-                <w:rFonts w:ascii="Aptos" w:hAnsi="Aptos"/>
-                <w:b w:val="0"/>
-                <w:color w:val="292D2A"/>
-                <w:sz w:val="16"/>
-              </w:rPr>
-              <w:t>No active volunteering or admin actions.</w:t>
+              <w:t>No active volunteering or administrative actions.</w:t>
             </w:r>
           </w:p>
         </w:tc>
       </w:tr>
     </w:tbl>
-    <w:p/>
     <w:p>
       <w:pPr>
         <w:pStyle w:val="Heading1"/>
@@ -1176,29 +790,22 @@
         <w:tblStyle w:val="TableGrid"/>
         <w:tblW w:type="auto" w:w="0"/>
         <w:jc w:val="center"/>
-        <w:tblLook w:firstColumn="1" w:firstRow="1" w:lastColumn="0" w:lastRow="0" w:noHBand="0" w:noVBand="1" w:val="04A0"/>
+        <w:tblLook w:firstRow="1" w:lastRow="0" w:firstColumn="1" w:lastColumn="0" w:noHBand="0" w:noVBand="1" w:val="04A0"/>
       </w:tblPr>
       <w:tblGrid>
-        <w:gridCol w:w="4997"/>
-        <w:gridCol w:w="4997"/>
+        <w:gridCol w:w="2800"/>
+        <w:gridCol w:w="6700"/>
       </w:tblGrid>
       <w:tr>
+        <w:trPr/>
         <w:tc>
           <w:tcPr>
-            <w:tcW w:type="dxa" w:w="4997"/>
-            <w:shd w:fill="1A3C29"/>
+            <w:tcW w:type="dxa" w:w="2800"/>
           </w:tcPr>
           <w:p>
-            <w:pPr>
-              <w:spacing w:after="40"/>
-            </w:pPr>
-            <w:r/>
             <w:r>
               <w:rPr>
-                <w:rFonts w:ascii="Aptos" w:hAnsi="Aptos"/>
                 <w:b/>
-                <w:color w:val="FFFFFF"/>
-                <w:sz w:val="16"/>
               </w:rPr>
               <w:t>Page</w:t>
             </w:r>
@@ -1206,20 +813,12 @@
         </w:tc>
         <w:tc>
           <w:tcPr>
-            <w:tcW w:type="dxa" w:w="4997"/>
-            <w:shd w:fill="1A3C29"/>
+            <w:tcW w:type="dxa" w:w="6700"/>
           </w:tcPr>
           <w:p>
-            <w:pPr>
-              <w:spacing w:after="40"/>
-            </w:pPr>
-            <w:r/>
             <w:r>
               <w:rPr>
-                <w:rFonts w:ascii="Aptos" w:hAnsi="Aptos"/>
                 <w:b/>
-                <w:color w:val="FFFFFF"/>
-                <w:sz w:val="16"/>
               </w:rPr>
               <w:t>Requirements</w:t>
             </w:r>
@@ -1227,523 +826,305 @@
         </w:tc>
       </w:tr>
       <w:tr>
+        <w:trPr/>
         <w:tc>
           <w:tcPr>
-            <w:tcW w:type="dxa" w:w="4997"/>
-            <w:shd w:fill="F8F7F3"/>
+            <w:tcW w:type="dxa" w:w="2800"/>
           </w:tcPr>
           <w:p>
-            <w:pPr>
-              <w:spacing w:after="40"/>
-            </w:pPr>
-            <w:r/>
             <w:r>
-              <w:rPr>
-                <w:rFonts w:ascii="Aptos" w:hAnsi="Aptos"/>
-                <w:b w:val="0"/>
-                <w:color w:val="292D2A"/>
-                <w:sz w:val="16"/>
-              </w:rPr>
               <w:t>Home</w:t>
             </w:r>
           </w:p>
         </w:tc>
         <w:tc>
           <w:tcPr>
-            <w:tcW w:type="dxa" w:w="4997"/>
-            <w:shd w:fill="F8F7F3"/>
+            <w:tcW w:type="dxa" w:w="6700"/>
           </w:tcPr>
           <w:p>
-            <w:pPr>
-              <w:spacing w:after="40"/>
-            </w:pPr>
-            <w:r/>
             <w:r>
-              <w:rPr>
-                <w:rFonts w:ascii="Aptos" w:hAnsi="Aptos"/>
-                <w:b w:val="0"/>
-                <w:color w:val="292D2A"/>
-                <w:sz w:val="16"/>
-              </w:rPr>
-              <w:t>Hero carousel; mission; featured events; verified impact; gallery; approved Core Team; announcements; volunteer CTA; contact.</w:t>
+              <w:t>Hero carousel; mission; featured events (NSS &amp; MY Bharat); verified impact; gallery; approved Core Team highlight; announcements; volunteer CTA (closed state); contact.</w:t>
             </w:r>
           </w:p>
         </w:tc>
       </w:tr>
       <w:tr>
+        <w:trPr/>
         <w:tc>
           <w:tcPr>
-            <w:tcW w:type="dxa" w:w="4997"/>
+            <w:tcW w:type="dxa" w:w="2800"/>
           </w:tcPr>
           <w:p>
-            <w:pPr>
-              <w:spacing w:after="40"/>
-            </w:pPr>
-            <w:r/>
             <w:r>
-              <w:rPr>
-                <w:rFonts w:ascii="Aptos" w:hAnsi="Aptos"/>
-                <w:b w:val="0"/>
-                <w:color w:val="292D2A"/>
-                <w:sz w:val="16"/>
-              </w:rPr>
               <w:t>About NSS</w:t>
             </w:r>
           </w:p>
         </w:tc>
         <w:tc>
           <w:tcPr>
-            <w:tcW w:type="dxa" w:w="4997"/>
+            <w:tcW w:type="dxa" w:w="6700"/>
           </w:tcPr>
           <w:p>
-            <w:pPr>
-              <w:spacing w:after="40"/>
-            </w:pPr>
-            <w:r/>
             <w:r>
-              <w:rPr>
-                <w:rFonts w:ascii="Aptos" w:hAnsi="Aptos"/>
-                <w:b w:val="0"/>
-                <w:color w:val="292D2A"/>
-                <w:sz w:val="16"/>
-              </w:rPr>
-              <w:t>Approved NSS VIIT (A) mission and institutional context.</w:t>
+              <w:t>Approved NSS VIIT (A) mission, institutional context and governance.</w:t>
             </w:r>
           </w:p>
         </w:tc>
       </w:tr>
       <w:tr>
+        <w:trPr/>
         <w:tc>
           <w:tcPr>
-            <w:tcW w:type="dxa" w:w="4997"/>
-            <w:shd w:fill="F8F7F3"/>
+            <w:tcW w:type="dxa" w:w="2800"/>
           </w:tcPr>
           <w:p>
-            <w:pPr>
-              <w:spacing w:after="40"/>
-            </w:pPr>
-            <w:r/>
             <w:r>
-              <w:rPr>
-                <w:rFonts w:ascii="Aptos" w:hAnsi="Aptos"/>
-                <w:b w:val="0"/>
-                <w:color w:val="292D2A"/>
-                <w:sz w:val="16"/>
-              </w:rPr>
+              <w:t>MY Bharat</w:t>
+            </w:r>
+          </w:p>
+        </w:tc>
+        <w:tc>
+          <w:tcPr>
+            <w:tcW w:type="dxa" w:w="6700"/>
+          </w:tcPr>
+          <w:p>
+            <w:r>
+              <w:t>Dedicated section: national linkage (Ministry of Youth Affairs and Sports), VIIT (A) youth cell objectives, active cell initiatives and student engagement pathways.</w:t>
+            </w:r>
+          </w:p>
+        </w:tc>
+      </w:tr>
+      <w:tr>
+        <w:trPr/>
+        <w:tc>
+          <w:tcPr>
+            <w:tcW w:type="dxa" w:w="2800"/>
+          </w:tcPr>
+          <w:p>
+            <w:r>
               <w:t>Events &amp; Activities</w:t>
             </w:r>
           </w:p>
         </w:tc>
         <w:tc>
           <w:tcPr>
-            <w:tcW w:type="dxa" w:w="4997"/>
-            <w:shd w:fill="F8F7F3"/>
+            <w:tcW w:type="dxa" w:w="6700"/>
           </w:tcPr>
           <w:p>
-            <w:pPr>
-              <w:spacing w:after="40"/>
-            </w:pPr>
-            <w:r/>
             <w:r>
-              <w:rPr>
-                <w:rFonts w:ascii="Aptos" w:hAnsi="Aptos"/>
-                <w:b w:val="0"/>
-                <w:color w:val="292D2A"/>
-                <w:sz w:val="16"/>
-              </w:rPr>
-              <w:t>Upcoming/past published events, filters, search and details.</w:t>
+              <w:t>Upcoming/past published events, filters (NSS, MY Bharat, Joint), search and event details.</w:t>
             </w:r>
           </w:p>
         </w:tc>
       </w:tr>
       <w:tr>
+        <w:trPr/>
         <w:tc>
           <w:tcPr>
-            <w:tcW w:type="dxa" w:w="4997"/>
+            <w:tcW w:type="dxa" w:w="2800"/>
           </w:tcPr>
           <w:p>
-            <w:pPr>
-              <w:spacing w:after="40"/>
-            </w:pPr>
-            <w:r/>
             <w:r>
-              <w:rPr>
-                <w:rFonts w:ascii="Aptos" w:hAnsi="Aptos"/>
-                <w:b w:val="0"/>
-                <w:color w:val="292D2A"/>
-                <w:sz w:val="16"/>
-              </w:rPr>
               <w:t>Calendar</w:t>
             </w:r>
           </w:p>
         </w:tc>
         <w:tc>
           <w:tcPr>
-            <w:tcW w:type="dxa" w:w="4997"/>
+            <w:tcW w:type="dxa" w:w="6700"/>
           </w:tcPr>
           <w:p>
-            <w:pPr>
-              <w:spacing w:after="40"/>
-            </w:pPr>
-            <w:r/>
             <w:r>
-              <w:rPr>
-                <w:rFonts w:ascii="Aptos" w:hAnsi="Aptos"/>
-                <w:b w:val="0"/>
-                <w:color w:val="292D2A"/>
-                <w:sz w:val="16"/>
-              </w:rPr>
-              <w:t>Calendar/list views, published events, .ics personal calendar export.</w:t>
+              <w:t>Calendar/list views, published events tagged by initiative, .ics personal calendar export.</w:t>
             </w:r>
           </w:p>
         </w:tc>
       </w:tr>
       <w:tr>
+        <w:trPr/>
         <w:tc>
           <w:tcPr>
-            <w:tcW w:type="dxa" w:w="4997"/>
-            <w:shd w:fill="F8F7F3"/>
+            <w:tcW w:type="dxa" w:w="2800"/>
           </w:tcPr>
           <w:p>
-            <w:pPr>
-              <w:spacing w:after="40"/>
-            </w:pPr>
-            <w:r/>
             <w:r>
-              <w:rPr>
-                <w:rFonts w:ascii="Aptos" w:hAnsi="Aptos"/>
-                <w:b w:val="0"/>
-                <w:color w:val="292D2A"/>
-                <w:sz w:val="16"/>
-              </w:rPr>
               <w:t>Gallery</w:t>
             </w:r>
           </w:p>
         </w:tc>
         <w:tc>
           <w:tcPr>
-            <w:tcW w:type="dxa" w:w="4997"/>
-            <w:shd w:fill="F8F7F3"/>
+            <w:tcW w:type="dxa" w:w="6700"/>
           </w:tcPr>
           <w:p>
-            <w:pPr>
-              <w:spacing w:after="40"/>
-            </w:pPr>
-            <w:r/>
             <w:r>
-              <w:rPr>
-                <w:rFonts w:ascii="Aptos" w:hAnsi="Aptos"/>
-                <w:b w:val="0"/>
-                <w:color w:val="292D2A"/>
-                <w:sz w:val="16"/>
-              </w:rPr>
-              <w:t>Approved albums by event, year and category, captions and event links.</w:t>
+              <w:t>Approved albums by initiative, event, year and category, captions and event links.</w:t>
             </w:r>
           </w:p>
         </w:tc>
       </w:tr>
       <w:tr>
+        <w:trPr/>
         <w:tc>
           <w:tcPr>
-            <w:tcW w:type="dxa" w:w="4997"/>
+            <w:tcW w:type="dxa" w:w="2800"/>
           </w:tcPr>
           <w:p>
-            <w:pPr>
-              <w:spacing w:after="40"/>
-            </w:pPr>
-            <w:r/>
             <w:r>
-              <w:rPr>
-                <w:rFonts w:ascii="Aptos" w:hAnsi="Aptos"/>
-                <w:b w:val="0"/>
-                <w:color w:val="292D2A"/>
-                <w:sz w:val="16"/>
-              </w:rPr>
               <w:t>Our Team</w:t>
             </w:r>
           </w:p>
         </w:tc>
         <w:tc>
           <w:tcPr>
-            <w:tcW w:type="dxa" w:w="4997"/>
+            <w:tcW w:type="dxa" w:w="6700"/>
           </w:tcPr>
           <w:p>
-            <w:pPr>
-              <w:spacing w:after="40"/>
-            </w:pPr>
-            <w:r/>
             <w:r>
-              <w:rPr>
-                <w:rFonts w:ascii="Aptos" w:hAnsi="Aptos"/>
-                <w:b w:val="0"/>
-                <w:color w:val="292D2A"/>
-                <w:sz w:val="16"/>
-              </w:rPr>
-              <w:t>Approved public Core Team profiles, designations and consented photos.</w:t>
+              <w:t>Official NSS Core Team roster (all 28 members: 24 NSS, 4 MY Bharat) with approved profiles, designations and consented photos.</w:t>
             </w:r>
           </w:p>
         </w:tc>
       </w:tr>
       <w:tr>
+        <w:trPr/>
         <w:tc>
           <w:tcPr>
-            <w:tcW w:type="dxa" w:w="4997"/>
-            <w:shd w:fill="F8F7F3"/>
+            <w:tcW w:type="dxa" w:w="2800"/>
           </w:tcPr>
           <w:p>
-            <w:pPr>
-              <w:spacing w:after="40"/>
-            </w:pPr>
-            <w:r/>
             <w:r>
-              <w:rPr>
-                <w:rFonts w:ascii="Aptos" w:hAnsi="Aptos"/>
-                <w:b w:val="0"/>
-                <w:color w:val="292D2A"/>
-                <w:sz w:val="16"/>
-              </w:rPr>
               <w:t>Volunteer With Us</w:t>
             </w:r>
           </w:p>
         </w:tc>
         <w:tc>
           <w:tcPr>
-            <w:tcW w:type="dxa" w:w="4997"/>
-            <w:shd w:fill="F8F7F3"/>
+            <w:tcW w:type="dxa" w:w="6700"/>
           </w:tcPr>
           <w:p>
-            <w:pPr>
-              <w:spacing w:after="40"/>
-            </w:pPr>
-            <w:r/>
             <w:r>
-              <w:rPr>
-                <w:rFonts w:ascii="Aptos" w:hAnsi="Aptos"/>
-                <w:b w:val="0"/>
-                <w:color w:val="292D2A"/>
-                <w:sz w:val="16"/>
-              </w:rPr>
-              <w:t>Registration information; portal remains closed until authorized launch.</w:t>
+              <w:t>Registration information across NSS, MY Bharat or Both; portal remains closed with clear notice until authorized launch.</w:t>
             </w:r>
           </w:p>
         </w:tc>
       </w:tr>
       <w:tr>
+        <w:trPr/>
         <w:tc>
           <w:tcPr>
-            <w:tcW w:type="dxa" w:w="4997"/>
+            <w:tcW w:type="dxa" w:w="2800"/>
           </w:tcPr>
           <w:p>
-            <w:pPr>
-              <w:spacing w:after="40"/>
-            </w:pPr>
-            <w:r/>
             <w:r>
-              <w:rPr>
-                <w:rFonts w:ascii="Aptos" w:hAnsi="Aptos"/>
-                <w:b w:val="0"/>
-                <w:color w:val="292D2A"/>
-                <w:sz w:val="16"/>
-              </w:rPr>
               <w:t>Heritage &amp; Resources</w:t>
             </w:r>
           </w:p>
         </w:tc>
         <w:tc>
           <w:tcPr>
-            <w:tcW w:type="dxa" w:w="4997"/>
+            <w:tcW w:type="dxa" w:w="6700"/>
           </w:tcPr>
           <w:p>
-            <w:pPr>
-              <w:spacing w:after="40"/>
-            </w:pPr>
-            <w:r/>
             <w:r>
-              <w:rPr>
-                <w:rFonts w:ascii="Aptos" w:hAnsi="Aptos"/>
-                <w:b w:val="0"/>
-                <w:color w:val="292D2A"/>
-                <w:sz w:val="16"/>
-              </w:rPr>
               <w:t>Verified NSS history, motto/emblem information and approved public documents.</w:t>
             </w:r>
           </w:p>
         </w:tc>
       </w:tr>
       <w:tr>
+        <w:trPr/>
         <w:tc>
           <w:tcPr>
-            <w:tcW w:type="dxa" w:w="4997"/>
-            <w:shd w:fill="F8F7F3"/>
+            <w:tcW w:type="dxa" w:w="2800"/>
           </w:tcPr>
           <w:p>
-            <w:pPr>
-              <w:spacing w:after="40"/>
-            </w:pPr>
-            <w:r/>
             <w:r>
-              <w:rPr>
-                <w:rFonts w:ascii="Aptos" w:hAnsi="Aptos"/>
-                <w:b w:val="0"/>
-                <w:color w:val="292D2A"/>
-                <w:sz w:val="16"/>
-              </w:rPr>
               <w:t>Announcements</w:t>
             </w:r>
           </w:p>
         </w:tc>
         <w:tc>
           <w:tcPr>
-            <w:tcW w:type="dxa" w:w="4997"/>
-            <w:shd w:fill="F8F7F3"/>
+            <w:tcW w:type="dxa" w:w="6700"/>
           </w:tcPr>
           <w:p>
-            <w:pPr>
-              <w:spacing w:after="40"/>
-            </w:pPr>
-            <w:r/>
             <w:r>
-              <w:rPr>
-                <w:rFonts w:ascii="Aptos" w:hAnsi="Aptos"/>
-                <w:b w:val="0"/>
-                <w:color w:val="292D2A"/>
-                <w:sz w:val="16"/>
-              </w:rPr>
-              <w:t>Latest approved notices and full listing.</w:t>
+              <w:t>Latest approved notices and full listing with initiative categorization.</w:t>
             </w:r>
           </w:p>
         </w:tc>
       </w:tr>
       <w:tr>
+        <w:trPr/>
         <w:tc>
           <w:tcPr>
-            <w:tcW w:type="dxa" w:w="4997"/>
+            <w:tcW w:type="dxa" w:w="2800"/>
           </w:tcPr>
           <w:p>
-            <w:pPr>
-              <w:spacing w:after="40"/>
-            </w:pPr>
-            <w:r/>
             <w:r>
-              <w:rPr>
-                <w:rFonts w:ascii="Aptos" w:hAnsi="Aptos"/>
-                <w:b w:val="0"/>
-                <w:color w:val="292D2A"/>
-                <w:sz w:val="16"/>
-              </w:rPr>
               <w:t>Contact</w:t>
             </w:r>
           </w:p>
         </w:tc>
         <w:tc>
           <w:tcPr>
-            <w:tcW w:type="dxa" w:w="4997"/>
+            <w:tcW w:type="dxa" w:w="6700"/>
           </w:tcPr>
           <w:p>
-            <w:pPr>
-              <w:spacing w:after="40"/>
-            </w:pPr>
-            <w:r/>
             <w:r>
-              <w:rPr>
-                <w:rFonts w:ascii="Aptos" w:hAnsi="Aptos"/>
-                <w:b w:val="0"/>
-                <w:color w:val="292D2A"/>
-                <w:sz w:val="16"/>
-              </w:rPr>
               <w:t>General enquiry form, spam protection and private admin inbox.</w:t>
             </w:r>
           </w:p>
         </w:tc>
       </w:tr>
       <w:tr>
+        <w:trPr/>
         <w:tc>
           <w:tcPr>
-            <w:tcW w:type="dxa" w:w="4997"/>
-            <w:shd w:fill="F8F7F3"/>
+            <w:tcW w:type="dxa" w:w="2800"/>
           </w:tcPr>
           <w:p>
-            <w:pPr>
-              <w:spacing w:after="40"/>
-            </w:pPr>
-            <w:r/>
             <w:r>
-              <w:rPr>
-                <w:rFonts w:ascii="Aptos" w:hAnsi="Aptos"/>
-                <w:b w:val="0"/>
-                <w:color w:val="292D2A"/>
-                <w:sz w:val="16"/>
-              </w:rPr>
               <w:t>Search</w:t>
             </w:r>
           </w:p>
         </w:tc>
         <w:tc>
           <w:tcPr>
-            <w:tcW w:type="dxa" w:w="4997"/>
-            <w:shd w:fill="F8F7F3"/>
+            <w:tcW w:type="dxa" w:w="6700"/>
           </w:tcPr>
           <w:p>
-            <w:pPr>
-              <w:spacing w:after="40"/>
-            </w:pPr>
-            <w:r/>
             <w:r>
-              <w:rPr>
-                <w:rFonts w:ascii="Aptos" w:hAnsi="Aptos"/>
-                <w:b w:val="0"/>
-                <w:color w:val="292D2A"/>
-                <w:sz w:val="16"/>
-              </w:rPr>
               <w:t>Public pages, notices, events, approved team profiles and public resources.</w:t>
             </w:r>
           </w:p>
         </w:tc>
       </w:tr>
       <w:tr>
+        <w:trPr/>
         <w:tc>
           <w:tcPr>
-            <w:tcW w:type="dxa" w:w="4997"/>
+            <w:tcW w:type="dxa" w:w="2800"/>
           </w:tcPr>
           <w:p>
-            <w:pPr>
-              <w:spacing w:after="40"/>
-            </w:pPr>
-            <w:r/>
             <w:r>
-              <w:rPr>
-                <w:rFonts w:ascii="Aptos" w:hAnsi="Aptos"/>
-                <w:b w:val="0"/>
-                <w:color w:val="292D2A"/>
-                <w:sz w:val="16"/>
-              </w:rPr>
               <w:t>Impact reports</w:t>
             </w:r>
           </w:p>
         </w:tc>
         <w:tc>
           <w:tcPr>
-            <w:tcW w:type="dxa" w:w="4997"/>
+            <w:tcW w:type="dxa" w:w="6700"/>
           </w:tcPr>
           <w:p>
-            <w:pPr>
-              <w:spacing w:after="40"/>
-            </w:pPr>
-            <w:r/>
             <w:r>
-              <w:rPr>
-                <w:rFonts w:ascii="Aptos" w:hAnsi="Aptos"/>
-                <w:b w:val="0"/>
-                <w:color w:val="292D2A"/>
-                <w:sz w:val="16"/>
-              </w:rPr>
               <w:t>Approved aggregate annual reports and PDF downloads when available.</w:t>
             </w:r>
           </w:p>
         </w:tc>
       </w:tr>
     </w:tbl>
-    <w:p/>
     <w:p>
       <w:pPr>
         <w:pStyle w:val="Heading1"/>
@@ -1754,20 +1135,55 @@
     </w:p>
     <w:p>
       <w:pPr>
-        <w:pStyle w:val="Heading1"/>
+        <w:pStyle w:val="Heading2"/>
       </w:pPr>
       <w:r>
         <w:t>6.1 Volunteer registration</w:t>
       </w:r>
     </w:p>
     <w:p>
+      <w:pPr>
+        <w:pStyle w:val="ListBullet"/>
+      </w:pPr>
       <w:r>
-        <w:t>Students may register with official college email or personal email and provide their college registration number. NSS Operations Admin manually checks eligibility against authorized college information. Email verification alone is not eligibility proof. Registration stays disabled during development.</w:t>
+        <w:t>One unified registration workflow allows applicants to select their track: NSS only, MY Bharat only, or Both.</w:t>
       </w:r>
     </w:p>
     <w:p>
       <w:pPr>
-        <w:pStyle w:val="Heading1"/>
+        <w:pStyle w:val="ListBullet"/>
+      </w:pPr>
+      <w:r>
+        <w:t>Students register with official college or personal email and provide their college registration number, department and year.</w:t>
+      </w:r>
+    </w:p>
+    <w:p>
+      <w:pPr>
+        <w:pStyle w:val="ListBullet"/>
+      </w:pPr>
+      <w:r>
+        <w:t>Operations Admin and MY Bharat Coordinator manually verify eligibility against authorized college information. Email verification alone is not eligibility proof.</w:t>
+      </w:r>
+    </w:p>
+    <w:p>
+      <w:pPr>
+        <w:pStyle w:val="ListBullet"/>
+      </w:pPr>
+      <w:r>
+        <w:t>Dual-track approval workflow: applications selecting Both require coordinated review (pending institutional confirmation on single vs dual sign-off).</w:t>
+      </w:r>
+    </w:p>
+    <w:p>
+      <w:pPr>
+        <w:pStyle w:val="ListBullet"/>
+      </w:pPr>
+      <w:r>
+        <w:t>Registration remains disabled throughout development; opens only by separate authorized decision.</w:t>
+      </w:r>
+    </w:p>
+    <w:p>
+      <w:pPr>
+        <w:pStyle w:val="Heading2"/>
       </w:pPr>
       <w:r>
         <w:t>6.2 Events and attendance</w:t>
@@ -1776,25 +1192,22 @@
     <w:p>
       <w:pPr>
         <w:pStyle w:val="ListBullet"/>
-        <w:spacing w:after="40"/>
       </w:pPr>
       <w:r>
-        <w:t>Core Team members can submit event proposals; Operations Admin review is required before publication.</w:t>
+        <w:t>Events are classified into three types: NSS, MY Bharat, and Joint initiatives.</w:t>
       </w:r>
     </w:p>
     <w:p>
       <w:pPr>
         <w:pStyle w:val="ListBullet"/>
-        <w:spacing w:after="40"/>
       </w:pPr>
       <w:r>
-        <w:t>Approved volunteers are the default audience; selected events may open to other college students.</w:t>
+        <w:t>Core Team members submit event proposals; approval by the respective administrator/coordinator is required before publication. Joint events require dual review and PO sign-off.</w:t>
       </w:r>
     </w:p>
     <w:p>
       <w:pPr>
         <w:pStyle w:val="ListBullet"/>
-        <w:spacing w:after="40"/>
       </w:pPr>
       <w:r>
         <w:t>Registration opens/closes on configured dates and closes on deadline or capacity. No default waitlist.</w:t>
@@ -1803,7 +1216,6 @@
     <w:p>
       <w:pPr>
         <w:pStyle w:val="ListBullet"/>
-        <w:spacing w:after="40"/>
       </w:pPr>
       <w:r>
         <w:t>Cancellation/rescheduling updates the public event/calendar and notifies registrants.</w:t>
@@ -1812,15 +1224,14 @@
     <w:p>
       <w:pPr>
         <w:pStyle w:val="ListBullet"/>
-        <w:spacing w:after="40"/>
       </w:pPr>
       <w:r>
-        <w:t>Attendance is manual. Only NSS Operations Admin corrects official attendance; actor, reason and timestamp are audited.</w:t>
+        <w:t>Attendance is manual only. Only authorized admins/coordinators correct official attendance; actor, reason and timestamp are audited.</w:t>
       </w:r>
     </w:p>
     <w:p>
       <w:pPr>
-        <w:pStyle w:val="Heading1"/>
+        <w:pStyle w:val="Heading2"/>
       </w:pPr>
       <w:r>
         <w:t>6.3 Service hours and certificates</w:t>
@@ -1829,42 +1240,46 @@
     <w:p>
       <w:pPr>
         <w:pStyle w:val="ListBullet"/>
-        <w:spacing w:after="40"/>
       </w:pPr>
       <w:r>
-        <w:t>Hours calculate from approved attendance; summaries by year, event, multi-day programme and special camp.</w:t>
+        <w:t>Hours calculate strictly from approved attendance; maintained in distinct ledgers (NSS hours vs MY Bharat hours).</w:t>
       </w:r>
     </w:p>
     <w:p>
       <w:pPr>
         <w:pStyle w:val="ListBullet"/>
-        <w:spacing w:after="40"/>
       </w:pPr>
       <w:r>
-        <w:t>The discussed 120-hour annual target must be confirmed against official NSS/institutional rules before becoming an eligibility rule.</w:t>
+        <w:t>CRITICAL INTEGRITY RULE: Service hours for Joint events must never be double-counted across ledgers. Crediting rules for joint events remain pending Programme Officer confirmation.</w:t>
       </w:r>
     </w:p>
     <w:p>
       <w:pPr>
         <w:pStyle w:val="ListBullet"/>
-        <w:spacing w:after="40"/>
       </w:pPr>
       <w:r>
-        <w:t>Annual Service and NSS Completion certificates are planned; eligibility calculation is followed by authorized approval.</w:t>
+        <w:t>The discussed 120-hour annual benchmark remains unconfirmed pending official institutional rules.</w:t>
       </w:r>
     </w:p>
     <w:p>
       <w:pPr>
         <w:pStyle w:val="ListBullet"/>
-        <w:spacing w:after="40"/>
       </w:pPr>
       <w:r>
-        <w:t>No public certificate verification page, QR code or public verification-ID workflow.</w:t>
+        <w:t>Annual Service and Completion certificates are planned; certificate eligibility criteria and formats remain pending institutional confirmation.</w:t>
       </w:r>
     </w:p>
     <w:p>
       <w:pPr>
-        <w:pStyle w:val="Heading1"/>
+        <w:pStyle w:val="ListBullet"/>
+      </w:pPr>
+      <w:r>
+        <w:t>Launch exclusions: no public certificate verification page, QR code or public verification-ID workflow.</w:t>
+      </w:r>
+    </w:p>
+    <w:p>
+      <w:pPr>
+        <w:pStyle w:val="Heading2"/>
       </w:pPr>
       <w:r>
         <w:t>6.4 Core Team work</w:t>
@@ -1873,7 +1288,6 @@
     <w:p>
       <w:pPr>
         <w:pStyle w:val="ListBullet"/>
-        <w:spacing w:after="40"/>
       </w:pPr>
       <w:r>
         <w:t>Tasks include assignees, priority, deadline, comments, restricted attachments, progress and review history.</w:t>
@@ -1882,7 +1296,6 @@
     <w:p>
       <w:pPr>
         <w:pStyle w:val="ListBullet"/>
-        <w:spacing w:after="40"/>
       </w:pPr>
       <w:r>
         <w:t>Deadline reminders and overdue labels; no automatic penalty.</w:t>
@@ -1891,7 +1304,6 @@
     <w:p>
       <w:pPr>
         <w:pStyle w:val="ListBullet"/>
-        <w:spacing w:after="40"/>
       </w:pPr>
       <w:r>
         <w:t>Meetings include schedule, agenda, attendance and minutes; meeting attendance is not automatically service hours.</w:t>
@@ -1900,7 +1312,6 @@
     <w:p>
       <w:pPr>
         <w:pStyle w:val="ListBullet"/>
-        <w:spacing w:after="40"/>
       </w:pPr>
       <w:r>
         <w:t>Authorized Core Team members can draft announcements; publication requires administrator approval.</w:t>
@@ -1909,10 +1320,9 @@
     <w:p>
       <w:pPr>
         <w:pStyle w:val="ListBullet"/>
-        <w:spacing w:after="40"/>
       </w:pPr>
       <w:r>
-        <w:t>Event reports/photos remain private until administrator approval.</w:t>
+        <w:t>Event reports and photos remain private until administrator approval.</w:t>
       </w:r>
     </w:p>
     <w:p>
@@ -1926,7 +1336,6 @@
     <w:p>
       <w:pPr>
         <w:pStyle w:val="ListBullet"/>
-        <w:spacing w:after="40"/>
       </w:pPr>
       <w:r>
         <w:t>Palette: ivory #F5F1E8, forest #1A3C29, champagne gold #C3A66B, charcoal #292D2A and white cards.</w:t>
@@ -1935,7 +1344,6 @@
     <w:p>
       <w:pPr>
         <w:pStyle w:val="ListBullet"/>
-        <w:spacing w:after="40"/>
       </w:pPr>
       <w:r>
         <w:t>Editorial serif headings, readable sans-serif body, generous whitespace and authentic approved imagery.</w:t>
@@ -1944,7 +1352,14 @@
     <w:p>
       <w:pPr>
         <w:pStyle w:val="ListBullet"/>
-        <w:spacing w:after="40"/>
+      </w:pPr>
+      <w:r>
+        <w:t>Contextual badge styling clearly identifies MY Bharat and Joint activities without clashing with the primary brand palette.</w:t>
+      </w:r>
+    </w:p>
+    <w:p>
+      <w:pPr>
+        <w:pStyle w:val="ListBullet"/>
       </w:pPr>
       <w:r>
         <w:t>Premium cinematic hero transitions, subtle reveal animations, refined drawer transitions, polished hover/focus states and accurate progress animation.</w:t>
@@ -1953,7 +1368,6 @@
     <w:p>
       <w:pPr>
         <w:pStyle w:val="ListBullet"/>
-        <w:spacing w:after="40"/>
       </w:pPr>
       <w:r>
         <w:t>Animations must not block input, cause layout shifts or obscure content; respect reduced-motion preference.</w:t>
@@ -1962,16 +1376,6 @@
     <w:p>
       <w:pPr>
         <w:pStyle w:val="ListBullet"/>
-        <w:spacing w:after="40"/>
-      </w:pPr>
-      <w:r>
-        <w:t>Hero has pause, previous/next, indicators and keyboard support.</w:t>
-      </w:r>
-    </w:p>
-    <w:p>
-      <w:pPr>
-        <w:pStyle w:val="ListBullet"/>
-        <w:spacing w:after="40"/>
       </w:pPr>
       <w:r>
         <w:t>Target WCAG 2.2 AA; verify before launch, do not claim compliance before testing.</w:t>
@@ -1990,29 +1394,22 @@
         <w:tblStyle w:val="TableGrid"/>
         <w:tblW w:type="auto" w:w="0"/>
         <w:jc w:val="center"/>
-        <w:tblLook w:firstColumn="1" w:firstRow="1" w:lastColumn="0" w:lastRow="0" w:noHBand="0" w:noVBand="1" w:val="04A0"/>
+        <w:tblLook w:firstRow="1" w:lastRow="0" w:firstColumn="1" w:lastColumn="0" w:noHBand="0" w:noVBand="1" w:val="04A0"/>
       </w:tblPr>
       <w:tblGrid>
-        <w:gridCol w:w="4997"/>
-        <w:gridCol w:w="4997"/>
+        <w:gridCol w:w="2800"/>
+        <w:gridCol w:w="6700"/>
       </w:tblGrid>
       <w:tr>
+        <w:trPr/>
         <w:tc>
           <w:tcPr>
-            <w:tcW w:type="dxa" w:w="4997"/>
-            <w:shd w:fill="1A3C29"/>
+            <w:tcW w:type="dxa" w:w="2800"/>
           </w:tcPr>
           <w:p>
-            <w:pPr>
-              <w:spacing w:after="40"/>
-            </w:pPr>
-            <w:r/>
             <w:r>
               <w:rPr>
-                <w:rFonts w:ascii="Aptos" w:hAnsi="Aptos"/>
                 <w:b/>
-                <w:color w:val="FFFFFF"/>
-                <w:sz w:val="16"/>
               </w:rPr>
               <w:t>Area</w:t>
             </w:r>
@@ -2020,20 +1417,12 @@
         </w:tc>
         <w:tc>
           <w:tcPr>
-            <w:tcW w:type="dxa" w:w="4997"/>
-            <w:shd w:fill="1A3C29"/>
+            <w:tcW w:type="dxa" w:w="6700"/>
           </w:tcPr>
           <w:p>
-            <w:pPr>
-              <w:spacing w:after="40"/>
-            </w:pPr>
-            <w:r/>
             <w:r>
               <w:rPr>
-                <w:rFonts w:ascii="Aptos" w:hAnsi="Aptos"/>
                 <w:b/>
-                <w:color w:val="FFFFFF"/>
-                <w:sz w:val="16"/>
               </w:rPr>
               <w:t>Requirement</w:t>
             </w:r>
@@ -2041,309 +1430,190 @@
         </w:tc>
       </w:tr>
       <w:tr>
+        <w:trPr/>
         <w:tc>
           <w:tcPr>
-            <w:tcW w:type="dxa" w:w="4997"/>
-            <w:shd w:fill="F8F7F3"/>
+            <w:tcW w:type="dxa" w:w="2800"/>
           </w:tcPr>
           <w:p>
-            <w:pPr>
-              <w:spacing w:after="40"/>
-            </w:pPr>
-            <w:r/>
             <w:r>
-              <w:rPr>
-                <w:rFonts w:ascii="Aptos" w:hAnsi="Aptos"/>
-                <w:b w:val="0"/>
-                <w:color w:val="292D2A"/>
-                <w:sz w:val="16"/>
-              </w:rPr>
               <w:t>Security</w:t>
             </w:r>
           </w:p>
         </w:tc>
         <w:tc>
           <w:tcPr>
-            <w:tcW w:type="dxa" w:w="4997"/>
-            <w:shd w:fill="F8F7F3"/>
+            <w:tcW w:type="dxa" w:w="6700"/>
           </w:tcPr>
           <w:p>
-            <w:pPr>
-              <w:spacing w:after="40"/>
-            </w:pPr>
-            <w:r/>
             <w:r>
-              <w:rPr>
-                <w:rFonts w:ascii="Aptos" w:hAnsi="Aptos"/>
-                <w:b w:val="0"/>
-                <w:color w:val="292D2A"/>
-                <w:sz w:val="16"/>
-              </w:rPr>
-              <w:t>Server-side authorization, least privilege, mandatory MFA for both primary admins, secure sessions, upload validation and audit logs.</w:t>
+              <w:t>Server-side authorization, least privilege, mandatory MFA for administrators, secure sessions, upload validation and audit logs.</w:t>
             </w:r>
           </w:p>
         </w:tc>
       </w:tr>
       <w:tr>
+        <w:trPr/>
         <w:tc>
           <w:tcPr>
-            <w:tcW w:type="dxa" w:w="4997"/>
+            <w:tcW w:type="dxa" w:w="2800"/>
           </w:tcPr>
           <w:p>
-            <w:pPr>
-              <w:spacing w:after="40"/>
-            </w:pPr>
-            <w:r/>
             <w:r>
-              <w:rPr>
-                <w:rFonts w:ascii="Aptos" w:hAnsi="Aptos"/>
-                <w:b w:val="0"/>
-                <w:color w:val="292D2A"/>
-                <w:sz w:val="16"/>
-              </w:rPr>
               <w:t>Privacy</w:t>
             </w:r>
           </w:p>
         </w:tc>
         <w:tc>
           <w:tcPr>
-            <w:tcW w:type="dxa" w:w="4997"/>
+            <w:tcW w:type="dxa" w:w="6700"/>
           </w:tcPr>
           <w:p>
-            <w:pPr>
-              <w:spacing w:after="40"/>
-            </w:pPr>
-            <w:r/>
             <w:r>
-              <w:rPr>
-                <w:rFonts w:ascii="Aptos" w:hAnsi="Aptos"/>
-                <w:b w:val="0"/>
-                <w:color w:val="292D2A"/>
-                <w:sz w:val="16"/>
-              </w:rPr>
-              <w:t>Minimum necessary data; private-by-default records; college-approved retention/deletion.</w:t>
+              <w:t>Minimum necessary data; private-by-default records; college-approved retention/deletion; volunteer data protected.</w:t>
             </w:r>
           </w:p>
         </w:tc>
       </w:tr>
       <w:tr>
+        <w:trPr/>
         <w:tc>
           <w:tcPr>
-            <w:tcW w:type="dxa" w:w="4997"/>
-            <w:shd w:fill="F8F7F3"/>
+            <w:tcW w:type="dxa" w:w="2800"/>
           </w:tcPr>
           <w:p>
-            <w:pPr>
-              <w:spacing w:after="40"/>
-            </w:pPr>
-            <w:r/>
             <w:r>
-              <w:rPr>
-                <w:rFonts w:ascii="Aptos" w:hAnsi="Aptos"/>
-                <w:b w:val="0"/>
-                <w:color w:val="292D2A"/>
-                <w:sz w:val="16"/>
-              </w:rPr>
+              <w:t>External Systems</w:t>
+            </w:r>
+          </w:p>
+        </w:tc>
+        <w:tc>
+          <w:tcPr>
+            <w:tcW w:type="dxa" w:w="6700"/>
+          </w:tcPr>
+          <w:p>
+            <w:r>
+              <w:t>No direct external MY Bharat API integration at launch; no SAC integration; all workflows managed internally.</w:t>
+            </w:r>
+          </w:p>
+        </w:tc>
+      </w:tr>
+      <w:tr>
+        <w:trPr/>
+        <w:tc>
+          <w:tcPr>
+            <w:tcW w:type="dxa" w:w="2800"/>
+          </w:tcPr>
+          <w:p>
+            <w:r>
               <w:t>Performance</w:t>
             </w:r>
           </w:p>
         </w:tc>
         <w:tc>
           <w:tcPr>
-            <w:tcW w:type="dxa" w:w="4997"/>
-            <w:shd w:fill="F8F7F3"/>
+            <w:tcW w:type="dxa" w:w="6700"/>
           </w:tcPr>
           <w:p>
-            <w:pPr>
-              <w:spacing w:after="40"/>
-            </w:pPr>
-            <w:r/>
             <w:r>
-              <w:rPr>
-                <w:rFonts w:ascii="Aptos" w:hAnsi="Aptos"/>
-                <w:b w:val="0"/>
-                <w:color w:val="292D2A"/>
-                <w:sz w:val="16"/>
-              </w:rPr>
-              <w:t>Set measurable response-time/Core Web Vitals thresholds in TRD and test on representative mobile devices.</w:t>
+              <w:t>Set measurable response-time/Core Web Vitals thresholds and test on representative mobile devices.</w:t>
             </w:r>
           </w:p>
         </w:tc>
       </w:tr>
       <w:tr>
+        <w:trPr/>
         <w:tc>
           <w:tcPr>
-            <w:tcW w:type="dxa" w:w="4997"/>
+            <w:tcW w:type="dxa" w:w="2800"/>
           </w:tcPr>
           <w:p>
-            <w:pPr>
-              <w:spacing w:after="40"/>
-            </w:pPr>
-            <w:r/>
             <w:r>
-              <w:rPr>
-                <w:rFonts w:ascii="Aptos" w:hAnsi="Aptos"/>
-                <w:b w:val="0"/>
-                <w:color w:val="292D2A"/>
-                <w:sz w:val="16"/>
-              </w:rPr>
               <w:t>Recovery</w:t>
             </w:r>
           </w:p>
         </w:tc>
         <w:tc>
           <w:tcPr>
-            <w:tcW w:type="dxa" w:w="4997"/>
+            <w:tcW w:type="dxa" w:w="6700"/>
           </w:tcPr>
           <w:p>
-            <w:pPr>
-              <w:spacing w:after="40"/>
-            </w:pPr>
-            <w:r/>
             <w:r>
-              <w:rPr>
-                <w:rFonts w:ascii="Aptos" w:hAnsi="Aptos"/>
-                <w:b w:val="0"/>
-                <w:color w:val="292D2A"/>
-                <w:sz w:val="16"/>
-              </w:rPr>
-              <w:t>Daily database backups and 90-day retention preference subject to provider limits/policy; include media/configuration and restore tests.</w:t>
+              <w:t>Daily database backups and 90-day retention preference subject to provider limits/policy; include restore tests.</w:t>
             </w:r>
           </w:p>
         </w:tc>
       </w:tr>
       <w:tr>
+        <w:trPr/>
         <w:tc>
           <w:tcPr>
-            <w:tcW w:type="dxa" w:w="4997"/>
-            <w:shd w:fill="F8F7F3"/>
+            <w:tcW w:type="dxa" w:w="2800"/>
           </w:tcPr>
           <w:p>
-            <w:pPr>
-              <w:spacing w:after="40"/>
-            </w:pPr>
-            <w:r/>
             <w:r>
-              <w:rPr>
-                <w:rFonts w:ascii="Aptos" w:hAnsi="Aptos"/>
-                <w:b w:val="0"/>
-                <w:color w:val="292D2A"/>
-                <w:sz w:val="16"/>
-              </w:rPr>
               <w:t>Accessibility</w:t>
             </w:r>
           </w:p>
         </w:tc>
         <w:tc>
           <w:tcPr>
-            <w:tcW w:type="dxa" w:w="4997"/>
-            <w:shd w:fill="F8F7F3"/>
+            <w:tcW w:type="dxa" w:w="6700"/>
           </w:tcPr>
           <w:p>
-            <w:pPr>
-              <w:spacing w:after="40"/>
-            </w:pPr>
-            <w:r/>
             <w:r>
-              <w:rPr>
-                <w:rFonts w:ascii="Aptos" w:hAnsi="Aptos"/>
-                <w:b w:val="0"/>
-                <w:color w:val="292D2A"/>
-                <w:sz w:val="16"/>
-              </w:rPr>
               <w:t>WCAG 2.2 AA target, keyboard support, focus, contrast, labels and reduced motion.</w:t>
             </w:r>
           </w:p>
         </w:tc>
       </w:tr>
       <w:tr>
+        <w:trPr/>
         <w:tc>
           <w:tcPr>
-            <w:tcW w:type="dxa" w:w="4997"/>
+            <w:tcW w:type="dxa" w:w="2800"/>
           </w:tcPr>
           <w:p>
-            <w:pPr>
-              <w:spacing w:after="40"/>
-            </w:pPr>
-            <w:r/>
             <w:r>
-              <w:rPr>
-                <w:rFonts w:ascii="Aptos" w:hAnsi="Aptos"/>
-                <w:b w:val="0"/>
-                <w:color w:val="292D2A"/>
-                <w:sz w:val="16"/>
-              </w:rPr>
               <w:t>Continuity</w:t>
             </w:r>
           </w:p>
         </w:tc>
         <w:tc>
           <w:tcPr>
-            <w:tcW w:type="dxa" w:w="4997"/>
+            <w:tcW w:type="dxa" w:w="6700"/>
           </w:tcPr>
           <w:p>
-            <w:pPr>
-              <w:spacing w:after="40"/>
-            </w:pPr>
-            <w:r/>
             <w:r>
-              <w:rPr>
-                <w:rFonts w:ascii="Aptos" w:hAnsi="Aptos"/>
-                <w:b w:val="0"/>
-                <w:color w:val="292D2A"/>
-                <w:sz w:val="16"/>
-              </w:rPr>
               <w:t>At least two authorized technical maintainers and documented handover.</w:t>
             </w:r>
           </w:p>
         </w:tc>
       </w:tr>
       <w:tr>
+        <w:trPr/>
         <w:tc>
           <w:tcPr>
-            <w:tcW w:type="dxa" w:w="4997"/>
-            <w:shd w:fill="F8F7F3"/>
+            <w:tcW w:type="dxa" w:w="2800"/>
           </w:tcPr>
           <w:p>
-            <w:pPr>
-              <w:spacing w:after="40"/>
-            </w:pPr>
-            <w:r/>
             <w:r>
-              <w:rPr>
-                <w:rFonts w:ascii="Aptos" w:hAnsi="Aptos"/>
-                <w:b w:val="0"/>
-                <w:color w:val="292D2A"/>
-                <w:sz w:val="16"/>
-              </w:rPr>
               <w:t>Cost</w:t>
             </w:r>
           </w:p>
         </w:tc>
         <w:tc>
           <w:tcPr>
-            <w:tcW w:type="dxa" w:w="4997"/>
-            <w:shd w:fill="F8F7F3"/>
+            <w:tcW w:type="dxa" w:w="6700"/>
           </w:tcPr>
           <w:p>
-            <w:pPr>
-              <w:spacing w:after="40"/>
-            </w:pPr>
-            <w:r/>
             <w:r>
-              <w:rPr>
-                <w:rFonts w:ascii="Aptos" w:hAnsi="Aptos"/>
-                <w:b w:val="0"/>
-                <w:color w:val="292D2A"/>
-                <w:sz w:val="16"/>
-              </w:rPr>
               <w:t>Prefer free services where practical, after verifying security, ownership and limits.</w:t>
             </w:r>
           </w:p>
         </w:tc>
       </w:tr>
     </w:tbl>
-    <w:p/>
     <w:p>
       <w:pPr>
         <w:pStyle w:val="Heading1"/>
@@ -2355,7 +1625,6 @@
     <w:p>
       <w:pPr>
         <w:pStyle w:val="ListBullet"/>
-        <w:spacing w:after="40"/>
       </w:pPr>
       <w:r>
         <w:t>Private dashboards and records cannot be accessed by unauthorized users.</w:t>
@@ -2364,34 +1633,30 @@
     <w:p>
       <w:pPr>
         <w:pStyle w:val="ListBullet"/>
-        <w:spacing w:after="40"/>
       </w:pPr>
       <w:r>
-        <w:t>Role permissions are server-enforced and tested for allowed and denied actions.</w:t>
+        <w:t>Role permissions are server-enforced and tested for allowed and denied actions across all administrative workspaces.</w:t>
       </w:r>
     </w:p>
     <w:p>
       <w:pPr>
         <w:pStyle w:val="ListBullet"/>
-        <w:spacing w:after="40"/>
       </w:pPr>
       <w:r>
-        <w:t>Registration stays closed until authorized; capacity/deadline rules work.</w:t>
+        <w:t>Registration stays closed until authorized; track selection (NSS/Bharat/Both) captures cleanly.</w:t>
       </w:r>
     </w:p>
     <w:p>
       <w:pPr>
         <w:pStyle w:val="ListBullet"/>
-        <w:spacing w:after="40"/>
       </w:pPr>
       <w:r>
-        <w:t>Attendance corrections are restricted and audited; hour totals recalculate from approved records.</w:t>
+        <w:t>Attendance corrections are restricted and audited; hour totals recalculate without double-counting joint events.</w:t>
       </w:r>
     </w:p>
     <w:p>
       <w:pPr>
         <w:pStyle w:val="ListBullet"/>
-        <w:spacing w:after="40"/>
       </w:pPr>
       <w:r>
         <w:t>Unapproved media/content remain private.</w:t>
@@ -2400,25 +1665,14 @@
     <w:p>
       <w:pPr>
         <w:pStyle w:val="ListBullet"/>
-        <w:spacing w:after="40"/>
       </w:pPr>
       <w:r>
-        <w:t>Certificate issuance requires administrator approval.</w:t>
+        <w:t>Certificate issuance requires administrator approval; rules confirmed by institution.</w:t>
       </w:r>
     </w:p>
     <w:p>
       <w:pPr>
         <w:pStyle w:val="ListBullet"/>
-        <w:spacing w:after="40"/>
-      </w:pPr>
-      <w:r>
-        <w:t>Notification/email failures are represented truthfully.</w:t>
-      </w:r>
-    </w:p>
-    <w:p>
-      <w:pPr>
-        <w:pStyle w:val="ListBullet"/>
-        <w:spacing w:after="40"/>
       </w:pPr>
       <w:r>
         <w:t>Backup restoration, mobile, accessibility, performance and joint approval checks pass.</w:t>
@@ -2429,53 +1683,57 @@
         <w:pStyle w:val="Heading1"/>
       </w:pPr>
       <w:r>
-        <w:t>10. Open decisions</w:t>
+        <w:t>10. Pending institutional confirmation</w:t>
       </w:r>
     </w:p>
     <w:p>
       <w:pPr>
         <w:pStyle w:val="ListBullet"/>
-        <w:spacing w:after="40"/>
       </w:pPr>
       <w:r>
-        <w:t>Confirm official service-hour, camp and certificate rules.</w:t>
+        <w:t>Pending Institutional Confirmation: Joint event service-hour crediting formula for students enrolled in both tracks.</w:t>
       </w:r>
     </w:p>
     <w:p>
       <w:pPr>
         <w:pStyle w:val="ListBullet"/>
-        <w:spacing w:after="40"/>
       </w:pPr>
       <w:r>
-        <w:t>Confirm eligibility-list fields and import/approval procedure.</w:t>
+        <w:t>Pending Institutional Confirmation: Official confirmation of 120-hour annual benchmark and camp hour rules.</w:t>
       </w:r>
     </w:p>
     <w:p>
       <w:pPr>
         <w:pStyle w:val="ListBullet"/>
-        <w:spacing w:after="40"/>
       </w:pPr>
       <w:r>
-        <w:t>Choose providers, hosting and email after cost/security review.</w:t>
+        <w:t>Pending Institutional Confirmation: Certificate eligibility criteria, certificate format and separate vs combined certificates.</w:t>
       </w:r>
     </w:p>
     <w:p>
       <w:pPr>
         <w:pStyle w:val="ListBullet"/>
-        <w:spacing w:after="40"/>
       </w:pPr>
       <w:r>
-        <w:t>Confirm domain ownership, retention policy, official contacts and confidential-report reviewers.</w:t>
+        <w:t>Pending Institutional Confirmation: Dual-track application review workflow (independent dual sign-off vs single PO approval).</w:t>
       </w:r>
     </w:p>
-    <w:sectPr>
-      <w:headerReference w:type="default" r:id="rId9"/>
-      <w:footerReference w:type="default" r:id="rId10"/>
-      <w:pgSz w:w="12240" w:h="15840"/>
-      <w:pgMar w:top="1008" w:right="1123" w:bottom="1008" w:left="1123" w:header="720" w:footer="720" w:gutter="0"/>
-      <w:cols w:space="720"/>
-      <w:docGrid w:linePitch="360"/>
-    </w:sectPr>
+    <w:p>
+      <w:pPr>
+        <w:pStyle w:val="ListBullet"/>
+      </w:pPr>
+      <w:r>
+        <w:t>Pending Institutional Confirmation: Eligibility criteria and departmental intake quotas for the 4 MY Bharat Core Team positions.</w:t>
+      </w:r>
+    </w:p>
+    <w:p>
+      <w:pPr>
+        <w:pStyle w:val="ListBullet"/>
+      </w:pPr>
+      <w:r>
+        <w:t>Pending Institutional Confirmation: Official domain ownership, retention policy, official contacts and confidential-report reviewers.</w:t>
+      </w:r>
+    </w:p>
   </w:body>
 </w:document>
 </file>

</xml_diff>